<commit_message>
artigo: tabela única com razão máx./mín. e Gini como medidas de dispersão
Co-Authored-By: Claude Sonnet 5.5 <noreply@anthropic.com>
Claude-Session: https://claude.ai/code/session_01TurhZD9BT23fwW9Mjr8E7S
</commit_message>
<xml_diff>
--- a/data/auditoria-pr-validacao/tabelas-artigo/tabela-unica-dispersao-percapita-pr.docx
+++ b/data/auditoria-pr-validacao/tabelas-artigo/tabela-unica-dispersao-percapita-pr.docx
@@ -2954,7 +2954,7 @@
                 <w:b w:val="0"/>
                 <w:sz w:val="18"/>
               </w:rPr>
-              <w:t>Média (R$)</w:t>
+              <w:t>Razão máx./mín.</w:t>
             </w:r>
           </w:p>
         </w:tc>
@@ -2991,7 +2991,7 @@
                 <w:b w:val="0"/>
                 <w:sz w:val="18"/>
               </w:rPr>
-              <w:t>2.030</w:t>
+              <w:t>13,1</w:t>
             </w:r>
           </w:p>
         </w:tc>
@@ -3010,7 +3010,7 @@
                 <w:b w:val="0"/>
                 <w:sz w:val="18"/>
               </w:rPr>
-              <w:t>2.178</w:t>
+              <w:t>12,6</w:t>
             </w:r>
           </w:p>
         </w:tc>
@@ -3029,7 +3029,7 @@
                 <w:b w:val="0"/>
                 <w:sz w:val="18"/>
               </w:rPr>
-              <w:t>2.312</w:t>
+              <w:t>13,0</w:t>
             </w:r>
           </w:p>
         </w:tc>
@@ -3048,7 +3048,7 @@
                 <w:b w:val="0"/>
                 <w:sz w:val="18"/>
               </w:rPr>
-              <w:t>3.347</w:t>
+              <w:t>6,5</w:t>
             </w:r>
           </w:p>
         </w:tc>
@@ -3067,543 +3067,7 @@
                 <w:b w:val="0"/>
                 <w:sz w:val="18"/>
               </w:rPr>
-              <w:t>6.018</w:t>
-            </w:r>
-          </w:p>
-        </w:tc>
-      </w:tr>
-      <w:tr>
-        <w:tc>
-          <w:tcPr>
-            <w:tcW w:type="dxa" w:w="2948"/>
-          </w:tcPr>
-          <w:p>
-            <w:pPr>
-              <w:spacing w:after="0"/>
-              <w:jc w:val="left"/>
-            </w:pPr>
-            <w:r/>
-            <w:r>
-              <w:rPr>
-                <w:b w:val="0"/>
-                <w:sz w:val="18"/>
-              </w:rPr>
-              <w:t>Desvio-padrão (R$)</w:t>
-            </w:r>
-          </w:p>
-        </w:tc>
-        <w:tc>
-          <w:tcPr>
-            <w:tcW w:type="dxa" w:w="1134"/>
-          </w:tcPr>
-          <w:p>
-            <w:pPr>
-              <w:spacing w:after="0"/>
-              <w:jc w:val="right"/>
-            </w:pPr>
-            <w:r/>
-            <w:r>
-              <w:rPr>
-                <w:b w:val="0"/>
-                <w:sz w:val="18"/>
-              </w:rPr>
-            </w:r>
-          </w:p>
-        </w:tc>
-        <w:tc>
-          <w:tcPr>
-            <w:tcW w:type="dxa" w:w="1077"/>
-          </w:tcPr>
-          <w:p>
-            <w:pPr>
-              <w:spacing w:after="0"/>
-              <w:jc w:val="right"/>
-            </w:pPr>
-            <w:r/>
-            <w:r>
-              <w:rPr>
-                <w:b w:val="0"/>
-                <w:sz w:val="18"/>
-              </w:rPr>
-              <w:t>906</w:t>
-            </w:r>
-          </w:p>
-        </w:tc>
-        <w:tc>
-          <w:tcPr>
-            <w:tcW w:type="dxa" w:w="1077"/>
-          </w:tcPr>
-          <w:p>
-            <w:pPr>
-              <w:spacing w:after="0"/>
-              <w:jc w:val="right"/>
-            </w:pPr>
-            <w:r/>
-            <w:r>
-              <w:rPr>
-                <w:b w:val="0"/>
-                <w:sz w:val="18"/>
-              </w:rPr>
-              <w:t>967</w:t>
-            </w:r>
-          </w:p>
-        </w:tc>
-        <w:tc>
-          <w:tcPr>
-            <w:tcW w:type="dxa" w:w="1077"/>
-          </w:tcPr>
-          <w:p>
-            <w:pPr>
-              <w:spacing w:after="0"/>
-              <w:jc w:val="right"/>
-            </w:pPr>
-            <w:r/>
-            <w:r>
-              <w:rPr>
-                <w:b w:val="0"/>
-                <w:sz w:val="18"/>
-              </w:rPr>
-              <w:t>1.063</w:t>
-            </w:r>
-          </w:p>
-        </w:tc>
-        <w:tc>
-          <w:tcPr>
-            <w:tcW w:type="dxa" w:w="1077"/>
-          </w:tcPr>
-          <w:p>
-            <w:pPr>
-              <w:spacing w:after="0"/>
-              <w:jc w:val="right"/>
-            </w:pPr>
-            <w:r/>
-            <w:r>
-              <w:rPr>
-                <w:b w:val="0"/>
-                <w:sz w:val="18"/>
-              </w:rPr>
-              <w:t>1.271</w:t>
-            </w:r>
-          </w:p>
-        </w:tc>
-        <w:tc>
-          <w:tcPr>
-            <w:tcW w:type="dxa" w:w="1077"/>
-          </w:tcPr>
-          <w:p>
-            <w:pPr>
-              <w:spacing w:after="0"/>
-              <w:jc w:val="right"/>
-            </w:pPr>
-            <w:r/>
-            <w:r>
-              <w:rPr>
-                <w:b w:val="0"/>
-                <w:sz w:val="18"/>
-              </w:rPr>
-              <w:t>1.583</w:t>
-            </w:r>
-          </w:p>
-        </w:tc>
-      </w:tr>
-      <w:tr>
-        <w:tc>
-          <w:tcPr>
-            <w:tcW w:type="dxa" w:w="2948"/>
-          </w:tcPr>
-          <w:p>
-            <w:pPr>
-              <w:spacing w:after="0"/>
-              <w:jc w:val="left"/>
-            </w:pPr>
-            <w:r/>
-            <w:r>
-              <w:rPr>
-                <w:b w:val="0"/>
-                <w:sz w:val="18"/>
-              </w:rPr>
-              <w:t>Coeficiente de variação (%)</w:t>
-            </w:r>
-          </w:p>
-        </w:tc>
-        <w:tc>
-          <w:tcPr>
-            <w:tcW w:type="dxa" w:w="1134"/>
-          </w:tcPr>
-          <w:p>
-            <w:pPr>
-              <w:spacing w:after="0"/>
-              <w:jc w:val="right"/>
-            </w:pPr>
-            <w:r/>
-            <w:r>
-              <w:rPr>
-                <w:b w:val="0"/>
-                <w:sz w:val="18"/>
-              </w:rPr>
-            </w:r>
-          </w:p>
-        </w:tc>
-        <w:tc>
-          <w:tcPr>
-            <w:tcW w:type="dxa" w:w="1077"/>
-          </w:tcPr>
-          <w:p>
-            <w:pPr>
-              <w:spacing w:after="0"/>
-              <w:jc w:val="right"/>
-            </w:pPr>
-            <w:r/>
-            <w:r>
-              <w:rPr>
-                <w:b w:val="0"/>
-                <w:sz w:val="18"/>
-              </w:rPr>
-              <w:t>44,6</w:t>
-            </w:r>
-          </w:p>
-        </w:tc>
-        <w:tc>
-          <w:tcPr>
-            <w:tcW w:type="dxa" w:w="1077"/>
-          </w:tcPr>
-          <w:p>
-            <w:pPr>
-              <w:spacing w:after="0"/>
-              <w:jc w:val="right"/>
-            </w:pPr>
-            <w:r/>
-            <w:r>
-              <w:rPr>
-                <w:b w:val="0"/>
-                <w:sz w:val="18"/>
-              </w:rPr>
-              <w:t>44,4</w:t>
-            </w:r>
-          </w:p>
-        </w:tc>
-        <w:tc>
-          <w:tcPr>
-            <w:tcW w:type="dxa" w:w="1077"/>
-          </w:tcPr>
-          <w:p>
-            <w:pPr>
-              <w:spacing w:after="0"/>
-              <w:jc w:val="right"/>
-            </w:pPr>
-            <w:r/>
-            <w:r>
-              <w:rPr>
-                <w:b w:val="0"/>
-                <w:sz w:val="18"/>
-              </w:rPr>
-              <w:t>46,0</w:t>
-            </w:r>
-          </w:p>
-        </w:tc>
-        <w:tc>
-          <w:tcPr>
-            <w:tcW w:type="dxa" w:w="1077"/>
-          </w:tcPr>
-          <w:p>
-            <w:pPr>
-              <w:spacing w:after="0"/>
-              <w:jc w:val="right"/>
-            </w:pPr>
-            <w:r/>
-            <w:r>
-              <w:rPr>
-                <w:b w:val="0"/>
-                <w:sz w:val="18"/>
-              </w:rPr>
-              <w:t>38,0</w:t>
-            </w:r>
-          </w:p>
-        </w:tc>
-        <w:tc>
-          <w:tcPr>
-            <w:tcW w:type="dxa" w:w="1077"/>
-          </w:tcPr>
-          <w:p>
-            <w:pPr>
-              <w:spacing w:after="0"/>
-              <w:jc w:val="right"/>
-            </w:pPr>
-            <w:r/>
-            <w:r>
-              <w:rPr>
-                <w:b w:val="0"/>
-                <w:sz w:val="18"/>
-              </w:rPr>
-              <w:t>26,3</w:t>
-            </w:r>
-          </w:p>
-        </w:tc>
-      </w:tr>
-      <w:tr>
-        <w:tc>
-          <w:tcPr>
-            <w:tcW w:type="dxa" w:w="2948"/>
-          </w:tcPr>
-          <w:p>
-            <w:pPr>
-              <w:spacing w:after="0"/>
-              <w:jc w:val="left"/>
-            </w:pPr>
-            <w:r/>
-            <w:r>
-              <w:rPr>
-                <w:b w:val="0"/>
-                <w:sz w:val="18"/>
-              </w:rPr>
-              <w:t>Desvio médio absoluto / média (%)</w:t>
-            </w:r>
-          </w:p>
-        </w:tc>
-        <w:tc>
-          <w:tcPr>
-            <w:tcW w:type="dxa" w:w="1134"/>
-          </w:tcPr>
-          <w:p>
-            <w:pPr>
-              <w:spacing w:after="0"/>
-              <w:jc w:val="right"/>
-            </w:pPr>
-            <w:r/>
-            <w:r>
-              <w:rPr>
-                <w:b w:val="0"/>
-                <w:sz w:val="18"/>
-              </w:rPr>
-            </w:r>
-          </w:p>
-        </w:tc>
-        <w:tc>
-          <w:tcPr>
-            <w:tcW w:type="dxa" w:w="1077"/>
-          </w:tcPr>
-          <w:p>
-            <w:pPr>
-              <w:spacing w:after="0"/>
-              <w:jc w:val="right"/>
-            </w:pPr>
-            <w:r/>
-            <w:r>
-              <w:rPr>
-                <w:b w:val="0"/>
-                <w:sz w:val="18"/>
-              </w:rPr>
-              <w:t>32,7</w:t>
-            </w:r>
-          </w:p>
-        </w:tc>
-        <w:tc>
-          <w:tcPr>
-            <w:tcW w:type="dxa" w:w="1077"/>
-          </w:tcPr>
-          <w:p>
-            <w:pPr>
-              <w:spacing w:after="0"/>
-              <w:jc w:val="right"/>
-            </w:pPr>
-            <w:r/>
-            <w:r>
-              <w:rPr>
-                <w:b w:val="0"/>
-                <w:sz w:val="18"/>
-              </w:rPr>
-              <w:t>32,5</w:t>
-            </w:r>
-          </w:p>
-        </w:tc>
-        <w:tc>
-          <w:tcPr>
-            <w:tcW w:type="dxa" w:w="1077"/>
-          </w:tcPr>
-          <w:p>
-            <w:pPr>
-              <w:spacing w:after="0"/>
-              <w:jc w:val="right"/>
-            </w:pPr>
-            <w:r/>
-            <w:r>
-              <w:rPr>
-                <w:b w:val="0"/>
-                <w:sz w:val="18"/>
-              </w:rPr>
-              <w:t>32,6</w:t>
-            </w:r>
-          </w:p>
-        </w:tc>
-        <w:tc>
-          <w:tcPr>
-            <w:tcW w:type="dxa" w:w="1077"/>
-          </w:tcPr>
-          <w:p>
-            <w:pPr>
-              <w:spacing w:after="0"/>
-              <w:jc w:val="right"/>
-            </w:pPr>
-            <w:r/>
-            <w:r>
-              <w:rPr>
-                <w:b w:val="0"/>
-                <w:sz w:val="18"/>
-              </w:rPr>
-              <w:t>26,5</w:t>
-            </w:r>
-          </w:p>
-        </w:tc>
-        <w:tc>
-          <w:tcPr>
-            <w:tcW w:type="dxa" w:w="1077"/>
-          </w:tcPr>
-          <w:p>
-            <w:pPr>
-              <w:spacing w:after="0"/>
-              <w:jc w:val="right"/>
-            </w:pPr>
-            <w:r/>
-            <w:r>
-              <w:rPr>
-                <w:b w:val="0"/>
-                <w:sz w:val="18"/>
-              </w:rPr>
-              <w:t>18,3</w:t>
-            </w:r>
-          </w:p>
-        </w:tc>
-      </w:tr>
-      <w:tr>
-        <w:tc>
-          <w:tcPr>
-            <w:tcW w:type="dxa" w:w="2948"/>
-          </w:tcPr>
-          <w:p>
-            <w:pPr>
-              <w:spacing w:after="0"/>
-              <w:jc w:val="left"/>
-            </w:pPr>
-            <w:r/>
-            <w:r>
-              <w:rPr>
-                <w:b w:val="0"/>
-                <w:sz w:val="18"/>
-              </w:rPr>
-              <w:t>Índice de Gini</w:t>
-            </w:r>
-          </w:p>
-        </w:tc>
-        <w:tc>
-          <w:tcPr>
-            <w:tcW w:type="dxa" w:w="1134"/>
-          </w:tcPr>
-          <w:p>
-            <w:pPr>
-              <w:spacing w:after="0"/>
-              <w:jc w:val="right"/>
-            </w:pPr>
-            <w:r/>
-            <w:r>
-              <w:rPr>
-                <w:b w:val="0"/>
-                <w:sz w:val="18"/>
-              </w:rPr>
-            </w:r>
-          </w:p>
-        </w:tc>
-        <w:tc>
-          <w:tcPr>
-            <w:tcW w:type="dxa" w:w="1077"/>
-          </w:tcPr>
-          <w:p>
-            <w:pPr>
-              <w:spacing w:after="0"/>
-              <w:jc w:val="right"/>
-            </w:pPr>
-            <w:r/>
-            <w:r>
-              <w:rPr>
-                <w:b w:val="0"/>
-                <w:sz w:val="18"/>
-              </w:rPr>
-              <w:t>0,230</w:t>
-            </w:r>
-          </w:p>
-        </w:tc>
-        <w:tc>
-          <w:tcPr>
-            <w:tcW w:type="dxa" w:w="1077"/>
-          </w:tcPr>
-          <w:p>
-            <w:pPr>
-              <w:spacing w:after="0"/>
-              <w:jc w:val="right"/>
-            </w:pPr>
-            <w:r/>
-            <w:r>
-              <w:rPr>
-                <w:b w:val="0"/>
-                <w:sz w:val="18"/>
-              </w:rPr>
-              <w:t>0,229</w:t>
-            </w:r>
-          </w:p>
-        </w:tc>
-        <w:tc>
-          <w:tcPr>
-            <w:tcW w:type="dxa" w:w="1077"/>
-          </w:tcPr>
-          <w:p>
-            <w:pPr>
-              <w:spacing w:after="0"/>
-              <w:jc w:val="right"/>
-            </w:pPr>
-            <w:r/>
-            <w:r>
-              <w:rPr>
-                <w:b w:val="0"/>
-                <w:sz w:val="18"/>
-              </w:rPr>
-              <w:t>0,229</w:t>
-            </w:r>
-          </w:p>
-        </w:tc>
-        <w:tc>
-          <w:tcPr>
-            <w:tcW w:type="dxa" w:w="1077"/>
-          </w:tcPr>
-          <w:p>
-            <w:pPr>
-              <w:spacing w:after="0"/>
-              <w:jc w:val="right"/>
-            </w:pPr>
-            <w:r/>
-            <w:r>
-              <w:rPr>
-                <w:b w:val="0"/>
-                <w:sz w:val="18"/>
-              </w:rPr>
-              <w:t>0,184</w:t>
-            </w:r>
-          </w:p>
-        </w:tc>
-        <w:tc>
-          <w:tcPr>
-            <w:tcW w:type="dxa" w:w="1077"/>
-          </w:tcPr>
-          <w:p>
-            <w:pPr>
-              <w:spacing w:after="0"/>
-              <w:jc w:val="right"/>
-            </w:pPr>
-            <w:r/>
-            <w:r>
-              <w:rPr>
-                <w:b w:val="0"/>
-                <w:sz w:val="18"/>
-              </w:rPr>
-              <w:t>0,122</w:t>
+              <w:t>3,0</w:t>
             </w:r>
           </w:p>
         </w:tc>
@@ -3627,7 +3091,7 @@
                 <w:b w:val="0"/>
                 <w:sz w:val="18"/>
               </w:rPr>
-              <w:t>Razão máx./mín.</w:t>
+              <w:t>Índice de Gini</w:t>
             </w:r>
           </w:p>
         </w:tc>
@@ -3670,7 +3134,7 @@
                 <w:b w:val="0"/>
                 <w:sz w:val="18"/>
               </w:rPr>
-              <w:t>13,1</w:t>
+              <w:t>0,230</w:t>
             </w:r>
           </w:p>
         </w:tc>
@@ -3692,7 +3156,7 @@
                 <w:b w:val="0"/>
                 <w:sz w:val="18"/>
               </w:rPr>
-              <w:t>12,6</w:t>
+              <w:t>0,229</w:t>
             </w:r>
           </w:p>
         </w:tc>
@@ -3714,7 +3178,7 @@
                 <w:b w:val="0"/>
                 <w:sz w:val="18"/>
               </w:rPr>
-              <w:t>13,0</w:t>
+              <w:t>0,229</w:t>
             </w:r>
           </w:p>
         </w:tc>
@@ -3736,7 +3200,7 @@
                 <w:b w:val="0"/>
                 <w:sz w:val="18"/>
               </w:rPr>
-              <w:t>6,5</w:t>
+              <w:t>0,184</w:t>
             </w:r>
           </w:p>
         </w:tc>
@@ -3758,7 +3222,7 @@
                 <w:b w:val="0"/>
                 <w:sz w:val="18"/>
               </w:rPr>
-              <w:t>3,0</w:t>
+              <w:t>0,122</w:t>
             </w:r>
           </w:p>
         </w:tc>
@@ -3785,7 +3249,7 @@
           <w:i/>
           <w:sz w:val="16"/>
         </w:rPr>
-        <w:t>Fonte: elaboração própria, com base na DCA/Siconfi, Portal da Transparência do PR e PIT/TCE-PR (base municipal final auditada). Receita per capita = ISS + cota-parte do ICMS em 2025, substituídos pelo IBS municipal de 2029 em diante, conforme o cronograma do art. 131 do ADCT (EC 132/2023) e PIB real de 2,2% a.a. após 2033. Valores em R$ constantes de 2025; população fixa (média 2019-2026). Medidas de dispersão calculadas sobre todos os municípios elegíveis, e não só os exibidos; o desvio-padrão em reais acompanha o crescimento real da receita, por isso o coeficiente de variação e o desvio médio relativo (ambos divididos pela média) são as medidas comparáveis entre anos.</w:t>
+        <w:t>Fonte: elaboração própria, com base na DCA/Siconfi, Portal da Transparência do PR e PIT/TCE-PR (base municipal final auditada). Receita per capita = ISS + cota-parte do ICMS em 2025, substituídos pelo IBS municipal de 2029 em diante, conforme o cronograma do art. 131 do ADCT (EC 132/2023) e PIB real de 2,2% a.a. após 2033. Valores em R$ constantes de 2025; população fixa (média 2019-2026). Razão máx./mín. = maior valor per capita dividido pelo menor; o Índice de Gini (0 = igualdade perfeita) considera todos os municípios elegíveis, e não só os exibidos.</w:t>
       </w:r>
     </w:p>
     <w:sectPr>

</xml_diff>

<commit_message>
Artigo do PR: cadeia inclui reprojeção auditada e tabela única; saídas regeneradas com f = 1,0
Co-Authored-By: Claude Sonnet 5.5 <noreply@anthropic.com>
Claude-Session: https://claude.ai/code/session_011eEoECqArDQbSEYFrfCHxJ
</commit_message>
<xml_diff>
--- a/data/auditoria-pr-validacao/tabelas-artigo/tabela-unica-dispersao-percapita-pr.docx
+++ b/data/auditoria-pr-validacao/tabelas-artigo/tabela-unica-dispersao-percapita-pr.docx
@@ -358,7 +358,7 @@
                 <w:i w:val="0"/>
                 <w:sz w:val="18"/>
               </w:rPr>
-              <w:t>6.927</w:t>
+              <w:t>6.929</w:t>
             </w:r>
           </w:p>
         </w:tc>
@@ -378,7 +378,7 @@
                 <w:i w:val="0"/>
                 <w:sz w:val="18"/>
               </w:rPr>
-              <w:t>7.537</w:t>
+              <w:t>7.546</w:t>
             </w:r>
           </w:p>
         </w:tc>
@@ -398,7 +398,7 @@
                 <w:i w:val="0"/>
                 <w:sz w:val="18"/>
               </w:rPr>
-              <w:t>9.513</w:t>
+              <w:t>9.570</w:t>
             </w:r>
           </w:p>
         </w:tc>
@@ -418,7 +418,7 @@
                 <w:i w:val="0"/>
                 <w:sz w:val="18"/>
               </w:rPr>
-              <w:t>13.044</w:t>
+              <w:t>13.274</w:t>
             </w:r>
           </w:p>
         </w:tc>
@@ -438,7 +438,7 @@
                 <w:i w:val="0"/>
                 <w:sz w:val="18"/>
               </w:rPr>
-              <w:t>+101,6%</w:t>
+              <w:t>+105,2%</w:t>
             </w:r>
           </w:p>
         </w:tc>
@@ -520,7 +520,7 @@
                 <w:i w:val="0"/>
                 <w:sz w:val="18"/>
               </w:rPr>
-              <w:t>6.849</w:t>
+              <w:t>6.851</w:t>
             </w:r>
           </w:p>
         </w:tc>
@@ -540,7 +540,7 @@
                 <w:i w:val="0"/>
                 <w:sz w:val="18"/>
               </w:rPr>
-              <w:t>7.958</w:t>
+              <w:t>7.967</w:t>
             </w:r>
           </w:p>
         </w:tc>
@@ -560,7 +560,7 @@
                 <w:i w:val="0"/>
                 <w:sz w:val="18"/>
               </w:rPr>
-              <w:t>9.897</w:t>
+              <w:t>9.928</w:t>
             </w:r>
           </w:p>
         </w:tc>
@@ -580,7 +580,7 @@
                 <w:i w:val="0"/>
                 <w:sz w:val="18"/>
               </w:rPr>
-              <w:t>13.089</w:t>
+              <w:t>13.213</w:t>
             </w:r>
           </w:p>
         </w:tc>
@@ -600,7 +600,7 @@
                 <w:i w:val="0"/>
                 <w:sz w:val="18"/>
               </w:rPr>
-              <w:t>+106,0%</w:t>
+              <w:t>+108,0%</w:t>
             </w:r>
           </w:p>
         </w:tc>
@@ -682,7 +682,7 @@
                 <w:i w:val="0"/>
                 <w:sz w:val="18"/>
               </w:rPr>
-              <w:t>6.750</w:t>
+              <w:t>6.752</w:t>
             </w:r>
           </w:p>
         </w:tc>
@@ -702,7 +702,7 @@
                 <w:i w:val="0"/>
                 <w:sz w:val="18"/>
               </w:rPr>
-              <w:t>7.425</w:t>
+              <w:t>7.434</w:t>
             </w:r>
           </w:p>
         </w:tc>
@@ -722,7 +722,7 @@
                 <w:i w:val="0"/>
                 <w:sz w:val="18"/>
               </w:rPr>
-              <w:t>9.393</w:t>
+              <w:t>9.410</w:t>
             </w:r>
           </w:p>
         </w:tc>
@@ -742,7 +742,7 @@
                 <w:i w:val="0"/>
                 <w:sz w:val="18"/>
               </w:rPr>
-              <w:t>12.963</w:t>
+              <w:t>13.032</w:t>
             </w:r>
           </w:p>
         </w:tc>
@@ -762,7 +762,7 @@
                 <w:i w:val="0"/>
                 <w:sz w:val="18"/>
               </w:rPr>
-              <w:t>+105,9%</w:t>
+              <w:t>+107,0%</w:t>
             </w:r>
           </w:p>
         </w:tc>
@@ -844,7 +844,7 @@
                 <w:i w:val="0"/>
                 <w:sz w:val="18"/>
               </w:rPr>
-              <w:t>5.901</w:t>
+              <w:t>5.902</w:t>
             </w:r>
           </w:p>
         </w:tc>
@@ -864,7 +864,7 @@
                 <w:i w:val="0"/>
                 <w:sz w:val="18"/>
               </w:rPr>
-              <w:t>5.332</w:t>
+              <w:t>5.341</w:t>
             </w:r>
           </w:p>
         </w:tc>
@@ -884,7 +884,7 @@
                 <w:i w:val="0"/>
                 <w:sz w:val="18"/>
               </w:rPr>
-              <w:t>7.289</w:t>
+              <w:t>7.296</w:t>
             </w:r>
           </w:p>
         </w:tc>
@@ -904,7 +904,7 @@
                 <w:i w:val="0"/>
                 <w:sz w:val="18"/>
               </w:rPr>
-              <w:t>11.837</w:t>
+              <w:t>11.866</w:t>
             </w:r>
           </w:p>
         </w:tc>
@@ -924,7 +924,7 @@
                 <w:i w:val="0"/>
                 <w:sz w:val="18"/>
               </w:rPr>
-              <w:t>+111,5%</w:t>
+              <w:t>+112,1%</w:t>
             </w:r>
           </w:p>
         </w:tc>
@@ -1006,7 +1006,7 @@
                 <w:i w:val="0"/>
                 <w:sz w:val="18"/>
               </w:rPr>
-              <w:t>5.984</w:t>
+              <w:t>5.985</w:t>
             </w:r>
           </w:p>
         </w:tc>
@@ -1026,7 +1026,7 @@
                 <w:i w:val="0"/>
                 <w:sz w:val="18"/>
               </w:rPr>
-              <w:t>6.492</w:t>
+              <w:t>6.501</w:t>
             </w:r>
           </w:p>
         </w:tc>
@@ -1046,7 +1046,7 @@
                 <w:i w:val="0"/>
                 <w:sz w:val="18"/>
               </w:rPr>
-              <w:t>8.550</w:t>
+              <w:t>8.591</w:t>
             </w:r>
           </w:p>
         </w:tc>
@@ -1066,7 +1066,7 @@
                 <w:i w:val="0"/>
                 <w:sz w:val="18"/>
               </w:rPr>
-              <w:t>12.896</w:t>
+              <w:t>13.060</w:t>
             </w:r>
           </w:p>
         </w:tc>
@@ -1086,7 +1086,7 @@
                 <w:i w:val="0"/>
                 <w:sz w:val="18"/>
               </w:rPr>
-              <w:t>+131,0%</w:t>
+              <w:t>+134,0%</w:t>
             </w:r>
           </w:p>
         </w:tc>
@@ -1168,7 +1168,7 @@
                 <w:i w:val="0"/>
                 <w:sz w:val="18"/>
               </w:rPr>
-              <w:t>5.421</w:t>
+              <w:t>5.423</w:t>
             </w:r>
           </w:p>
         </w:tc>
@@ -1188,7 +1188,7 @@
                 <w:i w:val="0"/>
                 <w:sz w:val="18"/>
               </w:rPr>
-              <w:t>4.695</w:t>
+              <w:t>4.702</w:t>
             </w:r>
           </w:p>
         </w:tc>
@@ -1208,7 +1208,7 @@
                 <w:i w:val="0"/>
                 <w:sz w:val="18"/>
               </w:rPr>
-              <w:t>6.420</w:t>
+              <w:t>6.433</w:t>
             </w:r>
           </w:p>
         </w:tc>
@@ -1228,7 +1228,7 @@
                 <w:i w:val="0"/>
                 <w:sz w:val="18"/>
               </w:rPr>
-              <w:t>10.433</w:t>
+              <w:t>10.483</w:t>
             </w:r>
           </w:p>
         </w:tc>
@@ -1248,7 +1248,7 @@
                 <w:i w:val="0"/>
                 <w:sz w:val="18"/>
               </w:rPr>
-              <w:t>+102,2%</w:t>
+              <w:t>+103,2%</w:t>
             </w:r>
           </w:p>
         </w:tc>
@@ -1330,7 +1330,7 @@
                 <w:i w:val="0"/>
                 <w:sz w:val="18"/>
               </w:rPr>
-              <w:t>4.903</w:t>
+              <w:t>4.904</w:t>
             </w:r>
           </w:p>
         </w:tc>
@@ -1350,7 +1350,7 @@
                 <w:i w:val="0"/>
                 <w:sz w:val="18"/>
               </w:rPr>
-              <w:t>5.593</w:t>
+              <w:t>5.602</w:t>
             </w:r>
           </w:p>
         </w:tc>
@@ -1370,7 +1370,7 @@
                 <w:i w:val="0"/>
                 <w:sz w:val="18"/>
               </w:rPr>
-              <w:t>7.668</w:t>
+              <w:t>7.710</w:t>
             </w:r>
           </w:p>
         </w:tc>
@@ -1390,7 +1390,7 @@
                 <w:i w:val="0"/>
                 <w:sz w:val="18"/>
               </w:rPr>
-              <w:t>12.506</w:t>
+              <w:t>12.674</w:t>
             </w:r>
           </w:p>
         </w:tc>
@@ -1410,7 +1410,7 @@
                 <w:i w:val="0"/>
                 <w:sz w:val="18"/>
               </w:rPr>
-              <w:t>+175,2%</w:t>
+              <w:t>+178,9%</w:t>
             </w:r>
           </w:p>
         </w:tc>
@@ -1492,7 +1492,7 @@
                 <w:i w:val="0"/>
                 <w:sz w:val="18"/>
               </w:rPr>
-              <w:t>5.029</w:t>
+              <w:t>5.031</w:t>
             </w:r>
           </w:p>
         </w:tc>
@@ -1512,7 +1512,7 @@
                 <w:i w:val="0"/>
                 <w:sz w:val="18"/>
               </w:rPr>
-              <w:t>8.217</w:t>
+              <w:t>8.226</w:t>
             </w:r>
           </w:p>
         </w:tc>
@@ -1532,7 +1532,7 @@
                 <w:i w:val="0"/>
                 <w:sz w:val="18"/>
               </w:rPr>
-              <w:t>10.109</w:t>
+              <w:t>10.162</w:t>
             </w:r>
           </w:p>
         </w:tc>
@@ -1552,7 +1552,7 @@
                 <w:i w:val="0"/>
                 <w:sz w:val="18"/>
               </w:rPr>
-              <w:t>13.016</w:t>
+              <w:t>13.229</w:t>
             </w:r>
           </w:p>
         </w:tc>
@@ -1572,7 +1572,7 @@
                 <w:i w:val="0"/>
                 <w:sz w:val="18"/>
               </w:rPr>
-              <w:t>+192,1%</w:t>
+              <w:t>+196,9%</w:t>
             </w:r>
           </w:p>
         </w:tc>
@@ -1654,7 +1654,7 @@
                 <w:i w:val="0"/>
                 <w:sz w:val="18"/>
               </w:rPr>
-              <w:t>4.581</w:t>
+              <w:t>4.583</w:t>
             </w:r>
           </w:p>
         </w:tc>
@@ -1674,7 +1674,7 @@
                 <w:i w:val="0"/>
                 <w:sz w:val="18"/>
               </w:rPr>
-              <w:t>4.806</w:t>
+              <w:t>4.813</w:t>
             </w:r>
           </w:p>
         </w:tc>
@@ -1694,7 +1694,7 @@
                 <w:i w:val="0"/>
                 <w:sz w:val="18"/>
               </w:rPr>
-              <w:t>6.562</w:t>
+              <w:t>6.578</w:t>
             </w:r>
           </w:p>
         </w:tc>
@@ -1714,7 +1714,7 @@
                 <w:i w:val="0"/>
                 <w:sz w:val="18"/>
               </w:rPr>
-              <w:t>10.639</w:t>
+              <w:t>10.703</w:t>
             </w:r>
           </w:p>
         </w:tc>
@@ -1734,7 +1734,7 @@
                 <w:i w:val="0"/>
                 <w:sz w:val="18"/>
               </w:rPr>
-              <w:t>+148,3%</w:t>
+              <w:t>+149,8%</w:t>
             </w:r>
           </w:p>
         </w:tc>
@@ -1816,7 +1816,7 @@
                 <w:i w:val="0"/>
                 <w:sz w:val="18"/>
               </w:rPr>
-              <w:t>4.541</w:t>
+              <w:t>4.543</w:t>
             </w:r>
           </w:p>
         </w:tc>
@@ -1836,7 +1836,7 @@
                 <w:i w:val="0"/>
                 <w:sz w:val="18"/>
               </w:rPr>
-              <w:t>4.832</w:t>
+              <w:t>4.839</w:t>
             </w:r>
           </w:p>
         </w:tc>
@@ -1856,7 +1856,7 @@
                 <w:i w:val="0"/>
                 <w:sz w:val="18"/>
               </w:rPr>
-              <w:t>6.592</w:t>
+              <w:t>6.635</w:t>
             </w:r>
           </w:p>
         </w:tc>
@@ -1876,7 +1876,7 @@
                 <w:i w:val="0"/>
                 <w:sz w:val="18"/>
               </w:rPr>
-              <w:t>10.674</w:t>
+              <w:t>10.846</w:t>
             </w:r>
           </w:p>
         </w:tc>
@@ -1896,7 +1896,7 @@
                 <w:i w:val="0"/>
                 <w:sz w:val="18"/>
               </w:rPr>
-              <w:t>+151,7%</w:t>
+              <w:t>+155,8%</w:t>
             </w:r>
           </w:p>
         </w:tc>
@@ -2140,7 +2140,7 @@
                 <w:i w:val="0"/>
                 <w:sz w:val="18"/>
               </w:rPr>
-              <w:t>990</w:t>
+              <w:t>992</w:t>
             </w:r>
           </w:p>
         </w:tc>
@@ -2160,7 +2160,7 @@
                 <w:i w:val="0"/>
                 <w:sz w:val="18"/>
               </w:rPr>
-              <w:t>1.175</w:t>
+              <w:t>1.188</w:t>
             </w:r>
           </w:p>
         </w:tc>
@@ -2180,7 +2180,7 @@
                 <w:i w:val="0"/>
                 <w:sz w:val="18"/>
               </w:rPr>
-              <w:t>2.170</w:t>
+              <w:t>2.254</w:t>
             </w:r>
           </w:p>
         </w:tc>
@@ -2200,7 +2200,7 @@
                 <w:i w:val="0"/>
                 <w:sz w:val="18"/>
               </w:rPr>
-              <w:t>5.245</w:t>
+              <w:t>5.584</w:t>
             </w:r>
           </w:p>
         </w:tc>
@@ -2220,7 +2220,7 @@
                 <w:i w:val="0"/>
                 <w:sz w:val="18"/>
               </w:rPr>
-              <w:t>+481,4%</w:t>
+              <w:t>+519,0%</w:t>
             </w:r>
           </w:p>
         </w:tc>
@@ -2302,7 +2302,7 @@
                 <w:i w:val="0"/>
                 <w:sz w:val="18"/>
               </w:rPr>
-              <w:t>915</w:t>
+              <w:t>916</w:t>
             </w:r>
           </w:p>
         </w:tc>
@@ -2322,7 +2322,7 @@
                 <w:i w:val="0"/>
                 <w:sz w:val="18"/>
               </w:rPr>
-              <w:t>939</w:t>
+              <w:t>942</w:t>
             </w:r>
           </w:p>
         </w:tc>
@@ -2342,7 +2342,7 @@
                 <w:i w:val="0"/>
                 <w:sz w:val="18"/>
               </w:rPr>
-              <w:t>1.844</w:t>
+              <w:t>1.869</w:t>
             </w:r>
           </w:p>
         </w:tc>
@@ -2362,7 +2362,7 @@
                 <w:i w:val="0"/>
                 <w:sz w:val="18"/>
               </w:rPr>
-              <w:t>4.704</w:t>
+              <w:t>4.805</w:t>
             </w:r>
           </w:p>
         </w:tc>
@@ -2382,7 +2382,7 @@
                 <w:i w:val="0"/>
                 <w:sz w:val="18"/>
               </w:rPr>
-              <w:t>+455,4%</w:t>
+              <w:t>+467,3%</w:t>
             </w:r>
           </w:p>
         </w:tc>
@@ -2464,7 +2464,7 @@
                 <w:i w:val="0"/>
                 <w:sz w:val="18"/>
               </w:rPr>
-              <w:t>847</w:t>
+              <w:t>849</w:t>
             </w:r>
           </w:p>
         </w:tc>
@@ -2484,7 +2484,7 @@
                 <w:i w:val="0"/>
                 <w:sz w:val="18"/>
               </w:rPr>
-              <w:t>1.070</w:t>
+              <w:t>1.082</w:t>
             </w:r>
           </w:p>
         </w:tc>
@@ -2504,7 +2504,7 @@
                 <w:i w:val="0"/>
                 <w:sz w:val="18"/>
               </w:rPr>
-              <w:t>2.062</w:t>
+              <w:t>2.135</w:t>
             </w:r>
           </w:p>
         </w:tc>
@@ -2524,7 +2524,7 @@
                 <w:i w:val="0"/>
                 <w:sz w:val="18"/>
               </w:rPr>
-              <w:t>5.174</w:t>
+              <w:t>5.469</w:t>
             </w:r>
           </w:p>
         </w:tc>
@@ -2544,7 +2544,7 @@
                 <w:i w:val="0"/>
                 <w:sz w:val="18"/>
               </w:rPr>
-              <w:t>+577,3%</w:t>
+              <w:t>+615,9%</w:t>
             </w:r>
           </w:p>
         </w:tc>
@@ -2646,7 +2646,7 @@
                 <w:i w:val="0"/>
                 <w:sz w:val="18"/>
               </w:rPr>
-              <w:t>791</w:t>
+              <w:t>792</w:t>
             </w:r>
           </w:p>
         </w:tc>
@@ -2666,7 +2666,7 @@
                 <w:i w:val="0"/>
                 <w:sz w:val="18"/>
               </w:rPr>
-              <w:t>1.796</w:t>
+              <w:t>1.804</w:t>
             </w:r>
           </w:p>
         </w:tc>
@@ -2686,7 +2686,7 @@
                 <w:i w:val="0"/>
                 <w:sz w:val="18"/>
               </w:rPr>
-              <w:t>5.095</w:t>
+              <w:t>5.128</w:t>
             </w:r>
           </w:p>
         </w:tc>
@@ -2706,7 +2706,7 @@
                 <w:i w:val="0"/>
                 <w:sz w:val="18"/>
               </w:rPr>
-              <w:t>+580,8%</w:t>
+              <w:t>+585,3%</w:t>
             </w:r>
           </w:p>
         </w:tc>
@@ -2788,7 +2788,7 @@
                 <w:i w:val="0"/>
                 <w:sz w:val="18"/>
               </w:rPr>
-              <w:t>795</w:t>
+              <w:t>793</w:t>
             </w:r>
           </w:p>
         </w:tc>
@@ -2808,7 +2808,7 @@
                 <w:i w:val="0"/>
                 <w:sz w:val="18"/>
               </w:rPr>
-              <w:t>864</w:t>
+              <w:t>854</w:t>
             </w:r>
           </w:p>
         </w:tc>
@@ -2828,7 +2828,7 @@
                 <w:i w:val="0"/>
                 <w:sz w:val="18"/>
               </w:rPr>
-              <w:t>1.792</w:t>
+              <w:t>1.727</w:t>
             </w:r>
           </w:p>
         </w:tc>
@@ -2848,7 +2848,7 @@
                 <w:i w:val="0"/>
                 <w:sz w:val="18"/>
               </w:rPr>
-              <w:t>4.770</w:t>
+              <w:t>4.510</w:t>
             </w:r>
           </w:p>
         </w:tc>
@@ -2868,7 +2868,7 @@
                 <w:i w:val="0"/>
                 <w:sz w:val="18"/>
               </w:rPr>
-              <w:t>+554,2%</w:t>
+              <w:t>+518,6%</w:t>
             </w:r>
           </w:p>
         </w:tc>
@@ -2970,7 +2970,7 @@
                 <w:i w:val="0"/>
                 <w:sz w:val="18"/>
               </w:rPr>
-              <w:t>761</w:t>
+              <w:t>759</w:t>
             </w:r>
           </w:p>
         </w:tc>
@@ -2990,7 +2990,7 @@
                 <w:i w:val="0"/>
                 <w:sz w:val="18"/>
               </w:rPr>
-              <w:t>1.692</w:t>
+              <w:t>1.681</w:t>
             </w:r>
           </w:p>
         </w:tc>
@@ -3010,7 +3010,7 @@
                 <w:i w:val="0"/>
                 <w:sz w:val="18"/>
               </w:rPr>
-              <w:t>4.734</w:t>
+              <w:t>4.690</w:t>
             </w:r>
           </w:p>
         </w:tc>
@@ -3030,7 +3030,7 @@
                 <w:i w:val="0"/>
                 <w:sz w:val="18"/>
               </w:rPr>
-              <w:t>+648,3%</w:t>
+              <w:t>+641,4%</w:t>
             </w:r>
           </w:p>
         </w:tc>
@@ -3112,7 +3112,7 @@
                 <w:i w:val="0"/>
                 <w:sz w:val="18"/>
               </w:rPr>
-              <w:t>733</w:t>
+              <w:t>735</w:t>
             </w:r>
           </w:p>
         </w:tc>
@@ -3132,7 +3132,7 @@
                 <w:i w:val="0"/>
                 <w:sz w:val="18"/>
               </w:rPr>
-              <w:t>1.563</w:t>
+              <w:t>1.573</w:t>
             </w:r>
           </w:p>
         </w:tc>
@@ -3152,7 +3152,7 @@
                 <w:i w:val="0"/>
                 <w:sz w:val="18"/>
               </w:rPr>
-              <w:t>2.479</w:t>
+              <w:t>2.538</w:t>
             </w:r>
           </w:p>
         </w:tc>
@@ -3172,7 +3172,7 @@
                 <w:i w:val="0"/>
                 <w:sz w:val="18"/>
               </w:rPr>
-              <w:t>5.078</w:t>
+              <w:t>5.315</w:t>
             </w:r>
           </w:p>
         </w:tc>
@@ -3192,7 +3192,7 @@
                 <w:i w:val="0"/>
                 <w:sz w:val="18"/>
               </w:rPr>
-              <w:t>+737,6%</w:t>
+              <w:t>+776,7%</w:t>
             </w:r>
           </w:p>
         </w:tc>
@@ -3274,7 +3274,7 @@
                 <w:i w:val="0"/>
                 <w:sz w:val="18"/>
               </w:rPr>
-              <w:t>660</w:t>
+              <w:t>664</w:t>
             </w:r>
           </w:p>
         </w:tc>
@@ -3294,7 +3294,7 @@
                 <w:i w:val="0"/>
                 <w:sz w:val="18"/>
               </w:rPr>
-              <w:t>701</w:t>
+              <w:t>723</w:t>
             </w:r>
           </w:p>
         </w:tc>
@@ -3314,7 +3314,7 @@
                 <w:i w:val="0"/>
                 <w:sz w:val="18"/>
               </w:rPr>
-              <w:t>1.555</w:t>
+              <w:t>1.693</w:t>
             </w:r>
           </w:p>
         </w:tc>
@@ -3334,7 +3334,7 @@
                 <w:i w:val="0"/>
                 <w:sz w:val="18"/>
               </w:rPr>
-              <w:t>4.343</w:t>
+              <w:t>4.896</w:t>
             </w:r>
           </w:p>
         </w:tc>
@@ -3354,7 +3354,7 @@
                 <w:i w:val="0"/>
                 <w:sz w:val="18"/>
               </w:rPr>
-              <w:t>+618,3%</w:t>
+              <w:t>+709,8%</w:t>
             </w:r>
           </w:p>
         </w:tc>
@@ -3456,7 +3456,7 @@
                 <w:i w:val="0"/>
                 <w:sz w:val="18"/>
               </w:rPr>
-              <w:t>721</w:t>
+              <w:t>722</w:t>
             </w:r>
           </w:p>
         </w:tc>
@@ -3476,7 +3476,7 @@
                 <w:i w:val="0"/>
                 <w:sz w:val="18"/>
               </w:rPr>
-              <w:t>1.625</w:t>
+              <w:t>1.634</w:t>
             </w:r>
           </w:p>
         </w:tc>
@@ -3496,7 +3496,7 @@
                 <w:i w:val="0"/>
                 <w:sz w:val="18"/>
               </w:rPr>
-              <w:t>4.586</w:t>
+              <w:t>4.624</w:t>
             </w:r>
           </w:p>
         </w:tc>
@@ -3516,7 +3516,7 @@
                 <w:i w:val="0"/>
                 <w:sz w:val="18"/>
               </w:rPr>
-              <w:t>+703,9%</w:t>
+              <w:t>+710,7%</w:t>
             </w:r>
           </w:p>
         </w:tc>
@@ -3598,7 +3598,7 @@
                 <w:i w:val="0"/>
                 <w:sz w:val="18"/>
               </w:rPr>
-              <w:t>550</w:t>
+              <w:t>549</w:t>
             </w:r>
           </w:p>
         </w:tc>
@@ -3618,7 +3618,7 @@
                 <w:i w:val="0"/>
                 <w:sz w:val="18"/>
               </w:rPr>
-              <w:t>632</w:t>
+              <w:t>625</w:t>
             </w:r>
           </w:p>
         </w:tc>
@@ -3638,7 +3638,7 @@
                 <w:i w:val="0"/>
                 <w:sz w:val="18"/>
               </w:rPr>
-              <w:t>1.572</w:t>
+              <w:t>1.530</w:t>
             </w:r>
           </w:p>
         </w:tc>
@@ -3658,7 +3658,7 @@
                 <w:i w:val="0"/>
                 <w:sz w:val="18"/>
               </w:rPr>
-              <w:t>4.707</w:t>
+              <w:t>4.541</w:t>
             </w:r>
           </w:p>
         </w:tc>
@@ -3678,7 +3678,7 @@
                 <w:i w:val="0"/>
                 <w:sz w:val="18"/>
               </w:rPr>
-              <w:t>+849,8%</w:t>
+              <w:t>+816,4%</w:t>
             </w:r>
           </w:p>
         </w:tc>
@@ -3777,7 +3777,7 @@
                 <w:i w:val="0"/>
                 <w:sz w:val="18"/>
               </w:rPr>
-              <w:t>13,0</w:t>
+              <w:t>13,2</w:t>
             </w:r>
           </w:p>
         </w:tc>
@@ -3801,7 +3801,7 @@
                 <w:i w:val="0"/>
                 <w:sz w:val="18"/>
               </w:rPr>
-              <w:t>6,5</w:t>
+              <w:t>6,6</w:t>
             </w:r>
           </w:p>
         </w:tc>
@@ -3825,7 +3825,7 @@
                 <w:i w:val="0"/>
                 <w:sz w:val="18"/>
               </w:rPr>
-              <w:t>3,0</w:t>
+              <w:t>2,9</w:t>
             </w:r>
           </w:p>
         </w:tc>
@@ -3849,7 +3849,7 @@
                 <w:i w:val="0"/>
                 <w:sz w:val="18"/>
               </w:rPr>
-              <w:t>−76,9%</w:t>
+              <w:t>−77,5%</w:t>
             </w:r>
           </w:p>
         </w:tc>
@@ -3948,7 +3948,7 @@
                 <w:i w:val="0"/>
                 <w:sz w:val="18"/>
               </w:rPr>
-              <w:t>0,228</w:t>
+              <w:t>0,227</w:t>
             </w:r>
           </w:p>
         </w:tc>
@@ -3972,7 +3972,7 @@
                 <w:i w:val="0"/>
                 <w:sz w:val="18"/>
               </w:rPr>
-              <w:t>0,183</w:t>
+              <w:t>0,182</w:t>
             </w:r>
           </w:p>
         </w:tc>
@@ -3996,7 +3996,7 @@
                 <w:i w:val="0"/>
                 <w:sz w:val="18"/>
               </w:rPr>
-              <w:t>0,120</w:t>
+              <w:t>0,130</w:t>
             </w:r>
           </w:p>
         </w:tc>
@@ -4020,7 +4020,7 @@
                 <w:i w:val="0"/>
                 <w:sz w:val="18"/>
               </w:rPr>
-              <w:t>−47,9%</w:t>
+              <w:t>−43,6%</w:t>
             </w:r>
           </w:p>
         </w:tc>

</xml_diff>

<commit_message>
Municípios do Paraná: base completa de 399 no mapa, na tabela per capita e no resumo; amostra de 187 vira teste de robustez
Co-Authored-By: Claude Sonnet 5.5 <noreply@anthropic.com>
Claude-Session: https://claude.ai/code/session_011eEoECqArDQbSEYFrfCHxJ
</commit_message>
<xml_diff>
--- a/data/auditoria-pr-validacao/tabelas-artigo/tabela-unica-dispersao-percapita-pr.docx
+++ b/data/auditoria-pr-validacao/tabelas-artigo/tabela-unica-dispersao-percapita-pr.docx
@@ -298,7 +298,169 @@
                 <w:i w:val="0"/>
                 <w:sz w:val="18"/>
               </w:rPr>
-              <w:t>1. Araucária</w:t>
+              <w:t>1. Mato Rico</w:t>
+            </w:r>
+          </w:p>
+        </w:tc>
+        <w:tc>
+          <w:tcPr>
+            <w:tcW w:type="dxa" w:w="1077"/>
+          </w:tcPr>
+          <w:p>
+            <w:pPr>
+              <w:spacing w:after="0" w:before="20"/>
+              <w:jc w:val="right"/>
+            </w:pPr>
+            <w:r/>
+            <w:r>
+              <w:rPr>
+                <w:b w:val="0"/>
+                <w:i w:val="0"/>
+                <w:sz w:val="18"/>
+              </w:rPr>
+              <w:t>3.221</w:t>
+            </w:r>
+          </w:p>
+        </w:tc>
+        <w:tc>
+          <w:tcPr>
+            <w:tcW w:type="dxa" w:w="992"/>
+          </w:tcPr>
+          <w:p>
+            <w:pPr>
+              <w:spacing w:after="0" w:before="20"/>
+              <w:jc w:val="right"/>
+            </w:pPr>
+            <w:r/>
+            <w:r>
+              <w:rPr>
+                <w:b w:val="0"/>
+                <w:i w:val="0"/>
+                <w:sz w:val="18"/>
+              </w:rPr>
+              <w:t>6.929</w:t>
+            </w:r>
+          </w:p>
+        </w:tc>
+        <w:tc>
+          <w:tcPr>
+            <w:tcW w:type="dxa" w:w="992"/>
+          </w:tcPr>
+          <w:p>
+            <w:pPr>
+              <w:spacing w:after="0" w:before="20"/>
+              <w:jc w:val="right"/>
+            </w:pPr>
+            <w:r/>
+            <w:r>
+              <w:rPr>
+                <w:b w:val="0"/>
+                <w:i w:val="0"/>
+                <w:sz w:val="18"/>
+              </w:rPr>
+              <w:t>7.292</w:t>
+            </w:r>
+          </w:p>
+        </w:tc>
+        <w:tc>
+          <w:tcPr>
+            <w:tcW w:type="dxa" w:w="992"/>
+          </w:tcPr>
+          <w:p>
+            <w:pPr>
+              <w:spacing w:after="0" w:before="20"/>
+              <w:jc w:val="right"/>
+            </w:pPr>
+            <w:r/>
+            <w:r>
+              <w:rPr>
+                <w:b w:val="0"/>
+                <w:i w:val="0"/>
+                <w:sz w:val="18"/>
+              </w:rPr>
+              <w:t>6.484</w:t>
+            </w:r>
+          </w:p>
+        </w:tc>
+        <w:tc>
+          <w:tcPr>
+            <w:tcW w:type="dxa" w:w="992"/>
+          </w:tcPr>
+          <w:p>
+            <w:pPr>
+              <w:spacing w:after="0" w:before="20"/>
+              <w:jc w:val="right"/>
+            </w:pPr>
+            <w:r/>
+            <w:r>
+              <w:rPr>
+                <w:b w:val="0"/>
+                <w:i w:val="0"/>
+                <w:sz w:val="18"/>
+              </w:rPr>
+              <w:t>8.628</w:t>
+            </w:r>
+          </w:p>
+        </w:tc>
+        <w:tc>
+          <w:tcPr>
+            <w:tcW w:type="dxa" w:w="992"/>
+          </w:tcPr>
+          <w:p>
+            <w:pPr>
+              <w:spacing w:after="0" w:before="20"/>
+              <w:jc w:val="right"/>
+            </w:pPr>
+            <w:r/>
+            <w:r>
+              <w:rPr>
+                <w:b w:val="0"/>
+                <w:i w:val="0"/>
+                <w:sz w:val="18"/>
+              </w:rPr>
+              <w:t>13.303</w:t>
+            </w:r>
+          </w:p>
+        </w:tc>
+        <w:tc>
+          <w:tcPr>
+            <w:tcW w:type="dxa" w:w="1162"/>
+          </w:tcPr>
+          <w:p>
+            <w:pPr>
+              <w:spacing w:after="0" w:before="20"/>
+              <w:jc w:val="right"/>
+            </w:pPr>
+            <w:r/>
+            <w:r>
+              <w:rPr>
+                <w:b w:val="0"/>
+                <w:i w:val="0"/>
+                <w:sz w:val="18"/>
+              </w:rPr>
+              <w:t>+92,0%</w:t>
+            </w:r>
+          </w:p>
+        </w:tc>
+      </w:tr>
+      <w:tr>
+        <w:tc>
+          <w:tcPr>
+            <w:tcW w:type="dxa" w:w="2438"/>
+          </w:tcPr>
+          <w:p>
+            <w:pPr>
+              <w:spacing w:after="0" w:before="20"/>
+              <w:jc w:val="left"/>
+            </w:pPr>
+            <w:r/>
+            <w:r>
+              <w:rPr>
+                <w:b w:val="0"/>
+                <w:i w:val="0"/>
+                <w:sz w:val="18"/>
+              </w:rPr>
+              <w:t>2. Araucária</w:t>
             </w:r>
           </w:p>
         </w:tc>
@@ -460,7 +622,7 @@
                 <w:i w:val="0"/>
                 <w:sz w:val="18"/>
               </w:rPr>
-              <w:t>2. Ortigueira</w:t>
+              <w:t>3. Ortigueira</w:t>
             </w:r>
           </w:p>
         </w:tc>
@@ -622,7 +784,7 @@
                 <w:i w:val="0"/>
                 <w:sz w:val="18"/>
               </w:rPr>
-              <w:t>3. Alto Paraíso</w:t>
+              <w:t>4. Alto Paraíso</w:t>
             </w:r>
           </w:p>
         </w:tc>
@@ -784,7 +946,7 @@
                 <w:i w:val="0"/>
                 <w:sz w:val="18"/>
               </w:rPr>
-              <w:t>4. Porto Barreiro</w:t>
+              <w:t>5. Porto Barreiro</w:t>
             </w:r>
           </w:p>
         </w:tc>
@@ -946,7 +1108,7 @@
                 <w:i w:val="0"/>
                 <w:sz w:val="18"/>
               </w:rPr>
-              <w:t>5. Serranópolis do Iguaçu</w:t>
+              <w:t>6. Serranópolis do Iguaçu</w:t>
             </w:r>
           </w:p>
         </w:tc>
@@ -1108,7 +1270,7 @@
                 <w:i w:val="0"/>
                 <w:sz w:val="18"/>
               </w:rPr>
-              <w:t>6. Campina do Simão</w:t>
+              <w:t>7. Campina do Simão</w:t>
             </w:r>
           </w:p>
         </w:tc>
@@ -1270,7 +1432,7 @@
                 <w:i w:val="0"/>
                 <w:sz w:val="18"/>
               </w:rPr>
-              <w:t>7. Maripá</w:t>
+              <w:t>8. Maripá</w:t>
             </w:r>
           </w:p>
         </w:tc>
@@ -1432,7 +1594,7 @@
                 <w:i w:val="0"/>
                 <w:sz w:val="18"/>
               </w:rPr>
-              <w:t>8. Saudade do Iguaçu</w:t>
+              <w:t>9. Saudade do Iguaçu</w:t>
             </w:r>
           </w:p>
         </w:tc>
@@ -1594,7 +1756,7 @@
                 <w:i w:val="0"/>
                 <w:sz w:val="18"/>
               </w:rPr>
-              <w:t>9. Bom Sucesso do Sul</w:t>
+              <w:t>10. Bom Sucesso do Sul</w:t>
             </w:r>
           </w:p>
         </w:tc>
@@ -1753,172 +1915,10 @@
             <w:r>
               <w:rPr>
                 <w:b w:val="0"/>
-                <w:i w:val="0"/>
-                <w:sz w:val="18"/>
-              </w:rPr>
-              <w:t>10. Quatro Pontes</w:t>
-            </w:r>
-          </w:p>
-        </w:tc>
-        <w:tc>
-          <w:tcPr>
-            <w:tcW w:type="dxa" w:w="1077"/>
-          </w:tcPr>
-          <w:p>
-            <w:pPr>
-              <w:spacing w:after="0" w:before="20"/>
-              <w:jc w:val="right"/>
-            </w:pPr>
-            <w:r/>
-            <w:r>
-              <w:rPr>
-                <w:b w:val="0"/>
-                <w:i w:val="0"/>
-                <w:sz w:val="18"/>
-              </w:rPr>
-              <w:t>4.279</w:t>
-            </w:r>
-          </w:p>
-        </w:tc>
-        <w:tc>
-          <w:tcPr>
-            <w:tcW w:type="dxa" w:w="992"/>
-          </w:tcPr>
-          <w:p>
-            <w:pPr>
-              <w:spacing w:after="0" w:before="20"/>
-              <w:jc w:val="right"/>
-            </w:pPr>
-            <w:r/>
-            <w:r>
-              <w:rPr>
-                <w:b w:val="0"/>
-                <w:i w:val="0"/>
-                <w:sz w:val="18"/>
-              </w:rPr>
-              <w:t>4.240</w:t>
-            </w:r>
-          </w:p>
-        </w:tc>
-        <w:tc>
-          <w:tcPr>
-            <w:tcW w:type="dxa" w:w="992"/>
-          </w:tcPr>
-          <w:p>
-            <w:pPr>
-              <w:spacing w:after="0" w:before="20"/>
-              <w:jc w:val="right"/>
-            </w:pPr>
-            <w:r/>
-            <w:r>
-              <w:rPr>
-                <w:b w:val="0"/>
-                <w:i w:val="0"/>
-                <w:sz w:val="18"/>
-              </w:rPr>
-              <w:t>4.543</w:t>
-            </w:r>
-          </w:p>
-        </w:tc>
-        <w:tc>
-          <w:tcPr>
-            <w:tcW w:type="dxa" w:w="992"/>
-          </w:tcPr>
-          <w:p>
-            <w:pPr>
-              <w:spacing w:after="0" w:before="20"/>
-              <w:jc w:val="right"/>
-            </w:pPr>
-            <w:r/>
-            <w:r>
-              <w:rPr>
-                <w:b w:val="0"/>
-                <w:i w:val="0"/>
-                <w:sz w:val="18"/>
-              </w:rPr>
-              <w:t>4.840</w:t>
-            </w:r>
-          </w:p>
-        </w:tc>
-        <w:tc>
-          <w:tcPr>
-            <w:tcW w:type="dxa" w:w="992"/>
-          </w:tcPr>
-          <w:p>
-            <w:pPr>
-              <w:spacing w:after="0" w:before="20"/>
-              <w:jc w:val="right"/>
-            </w:pPr>
-            <w:r/>
-            <w:r>
-              <w:rPr>
-                <w:b w:val="0"/>
-                <w:i w:val="0"/>
-                <w:sz w:val="18"/>
-              </w:rPr>
-              <w:t>6.659</w:t>
-            </w:r>
-          </w:p>
-        </w:tc>
-        <w:tc>
-          <w:tcPr>
-            <w:tcW w:type="dxa" w:w="992"/>
-          </w:tcPr>
-          <w:p>
-            <w:pPr>
-              <w:spacing w:after="0" w:before="20"/>
-              <w:jc w:val="right"/>
-            </w:pPr>
-            <w:r/>
-            <w:r>
-              <w:rPr>
-                <w:b w:val="0"/>
-                <w:i w:val="0"/>
-                <w:sz w:val="18"/>
-              </w:rPr>
-              <w:t>10.958</w:t>
-            </w:r>
-          </w:p>
-        </w:tc>
-        <w:tc>
-          <w:tcPr>
-            <w:tcW w:type="dxa" w:w="1162"/>
-          </w:tcPr>
-          <w:p>
-            <w:pPr>
-              <w:spacing w:after="0" w:before="20"/>
-              <w:jc w:val="right"/>
-            </w:pPr>
-            <w:r/>
-            <w:r>
-              <w:rPr>
-                <w:b w:val="0"/>
-                <w:i w:val="0"/>
-                <w:sz w:val="18"/>
-              </w:rPr>
-              <w:t>+158,4%</w:t>
-            </w:r>
-          </w:p>
-        </w:tc>
-      </w:tr>
-      <w:tr>
-        <w:tc>
-          <w:tcPr>
-            <w:tcW w:type="dxa" w:w="2438"/>
-          </w:tcPr>
-          <w:p>
-            <w:pPr>
-              <w:spacing w:after="0" w:before="20"/>
-              <w:jc w:val="left"/>
-            </w:pPr>
-            <w:r/>
-            <w:r>
-              <w:rPr>
-                <w:b w:val="0"/>
                 <w:i/>
                 <w:sz w:val="18"/>
               </w:rPr>
-              <w:t>... (348 municípios omitidos)</w:t>
+              <w:t>... (379 municípios omitidos)</w:t>
             </w:r>
           </w:p>
         </w:tc>
@@ -2080,169 +2080,7 @@
                 <w:i w:val="0"/>
                 <w:sz w:val="18"/>
               </w:rPr>
-              <w:t>359. Porecatu</w:t>
-            </w:r>
-          </w:p>
-        </w:tc>
-        <w:tc>
-          <w:tcPr>
-            <w:tcW w:type="dxa" w:w="1077"/>
-          </w:tcPr>
-          <w:p>
-            <w:pPr>
-              <w:spacing w:after="0" w:before="20"/>
-              <w:jc w:val="right"/>
-            </w:pPr>
-            <w:r/>
-            <w:r>
-              <w:rPr>
-                <w:b w:val="0"/>
-                <w:i w:val="0"/>
-                <w:sz w:val="18"/>
-              </w:rPr>
-              <w:t>12.192</w:t>
-            </w:r>
-          </w:p>
-        </w:tc>
-        <w:tc>
-          <w:tcPr>
-            <w:tcW w:type="dxa" w:w="992"/>
-          </w:tcPr>
-          <w:p>
-            <w:pPr>
-              <w:spacing w:after="0" w:before="20"/>
-              <w:jc w:val="right"/>
-            </w:pPr>
-            <w:r/>
-            <w:r>
-              <w:rPr>
-                <w:b w:val="0"/>
-                <w:i w:val="0"/>
-                <w:sz w:val="18"/>
-              </w:rPr>
-              <w:t>902</w:t>
-            </w:r>
-          </w:p>
-        </w:tc>
-        <w:tc>
-          <w:tcPr>
-            <w:tcW w:type="dxa" w:w="992"/>
-          </w:tcPr>
-          <w:p>
-            <w:pPr>
-              <w:spacing w:after="0" w:before="20"/>
-              <w:jc w:val="right"/>
-            </w:pPr>
-            <w:r/>
-            <w:r>
-              <w:rPr>
-                <w:b w:val="0"/>
-                <w:i w:val="0"/>
-                <w:sz w:val="18"/>
-              </w:rPr>
-              <w:t>994</w:t>
-            </w:r>
-          </w:p>
-        </w:tc>
-        <w:tc>
-          <w:tcPr>
-            <w:tcW w:type="dxa" w:w="992"/>
-          </w:tcPr>
-          <w:p>
-            <w:pPr>
-              <w:spacing w:after="0" w:before="20"/>
-              <w:jc w:val="right"/>
-            </w:pPr>
-            <w:r/>
-            <w:r>
-              <w:rPr>
-                <w:b w:val="0"/>
-                <w:i w:val="0"/>
-                <w:sz w:val="18"/>
-              </w:rPr>
-              <w:t>1.197</w:t>
-            </w:r>
-          </w:p>
-        </w:tc>
-        <w:tc>
-          <w:tcPr>
-            <w:tcW w:type="dxa" w:w="992"/>
-          </w:tcPr>
-          <w:p>
-            <w:pPr>
-              <w:spacing w:after="0" w:before="20"/>
-              <w:jc w:val="right"/>
-            </w:pPr>
-            <w:r/>
-            <w:r>
-              <w:rPr>
-                <w:b w:val="0"/>
-                <w:i w:val="0"/>
-                <w:sz w:val="18"/>
-              </w:rPr>
-              <w:t>2.331</w:t>
-            </w:r>
-          </w:p>
-        </w:tc>
-        <w:tc>
-          <w:tcPr>
-            <w:tcW w:type="dxa" w:w="992"/>
-          </w:tcPr>
-          <w:p>
-            <w:pPr>
-              <w:spacing w:after="0" w:before="20"/>
-              <w:jc w:val="right"/>
-            </w:pPr>
-            <w:r/>
-            <w:r>
-              <w:rPr>
-                <w:b w:val="0"/>
-                <w:i w:val="0"/>
-                <w:sz w:val="18"/>
-              </w:rPr>
-              <w:t>5.904</w:t>
-            </w:r>
-          </w:p>
-        </w:tc>
-        <w:tc>
-          <w:tcPr>
-            <w:tcW w:type="dxa" w:w="1162"/>
-          </w:tcPr>
-          <w:p>
-            <w:pPr>
-              <w:spacing w:after="0" w:before="20"/>
-              <w:jc w:val="right"/>
-            </w:pPr>
-            <w:r/>
-            <w:r>
-              <w:rPr>
-                <w:b w:val="0"/>
-                <w:i w:val="0"/>
-                <w:sz w:val="18"/>
-              </w:rPr>
-              <w:t>+554,5%</w:t>
-            </w:r>
-          </w:p>
-        </w:tc>
-      </w:tr>
-      <w:tr>
-        <w:tc>
-          <w:tcPr>
-            <w:tcW w:type="dxa" w:w="2438"/>
-          </w:tcPr>
-          <w:p>
-            <w:pPr>
-              <w:spacing w:after="0" w:before="20"/>
-              <w:jc w:val="left"/>
-            </w:pPr>
-            <w:r/>
-            <w:r>
-              <w:rPr>
-                <w:b w:val="0"/>
-                <w:i w:val="0"/>
-                <w:sz w:val="18"/>
-              </w:rPr>
-              <w:t>360. Fazenda Rio Grande</w:t>
+              <w:t>390. Fazenda Rio Grande</w:t>
             </w:r>
           </w:p>
         </w:tc>
@@ -2404,7 +2242,7 @@
                 <w:i w:val="0"/>
                 <w:sz w:val="18"/>
               </w:rPr>
-              <w:t>361. Figueira</w:t>
+              <w:t>391. Figueira</w:t>
             </w:r>
           </w:p>
         </w:tc>
@@ -2566,7 +2404,7 @@
                 <w:i w:val="0"/>
                 <w:sz w:val="18"/>
               </w:rPr>
-              <w:t>362. Matinhos</w:t>
+              <w:t>392. Matinhos</w:t>
             </w:r>
           </w:p>
         </w:tc>
@@ -2728,7 +2566,7 @@
                 <w:i w:val="0"/>
                 <w:sz w:val="18"/>
               </w:rPr>
-              <w:t>363. Colombo</w:t>
+              <w:t>393. Colombo</w:t>
             </w:r>
           </w:p>
         </w:tc>
@@ -2890,7 +2728,169 @@
                 <w:i w:val="0"/>
                 <w:sz w:val="18"/>
               </w:rPr>
-              <w:t>364. Paiçandu</w:t>
+              <w:t>394. Jataizinho</w:t>
+            </w:r>
+          </w:p>
+        </w:tc>
+        <w:tc>
+          <w:tcPr>
+            <w:tcW w:type="dxa" w:w="1077"/>
+          </w:tcPr>
+          <w:p>
+            <w:pPr>
+              <w:spacing w:after="0" w:before="20"/>
+              <w:jc w:val="right"/>
+            </w:pPr>
+            <w:r/>
+            <w:r>
+              <w:rPr>
+                <w:b w:val="0"/>
+                <w:i w:val="0"/>
+                <w:sz w:val="18"/>
+              </w:rPr>
+              <w:t>12.376</w:t>
+            </w:r>
+          </w:p>
+        </w:tc>
+        <w:tc>
+          <w:tcPr>
+            <w:tcW w:type="dxa" w:w="992"/>
+          </w:tcPr>
+          <w:p>
+            <w:pPr>
+              <w:spacing w:after="0" w:before="20"/>
+              <w:jc w:val="right"/>
+            </w:pPr>
+            <w:r/>
+            <w:r>
+              <w:rPr>
+                <w:b w:val="0"/>
+                <w:i w:val="0"/>
+                <w:sz w:val="18"/>
+              </w:rPr>
+              <w:t>728</w:t>
+            </w:r>
+          </w:p>
+        </w:tc>
+        <w:tc>
+          <w:tcPr>
+            <w:tcW w:type="dxa" w:w="992"/>
+          </w:tcPr>
+          <w:p>
+            <w:pPr>
+              <w:spacing w:after="0" w:before="20"/>
+              <w:jc w:val="right"/>
+            </w:pPr>
+            <w:r/>
+            <w:r>
+              <w:rPr>
+                <w:b w:val="0"/>
+                <w:i w:val="0"/>
+                <w:sz w:val="18"/>
+              </w:rPr>
+              <w:t>804</w:t>
+            </w:r>
+          </w:p>
+        </w:tc>
+        <w:tc>
+          <w:tcPr>
+            <w:tcW w:type="dxa" w:w="992"/>
+          </w:tcPr>
+          <w:p>
+            <w:pPr>
+              <w:spacing w:after="0" w:before="20"/>
+              <w:jc w:val="right"/>
+            </w:pPr>
+            <w:r/>
+            <w:r>
+              <w:rPr>
+                <w:b w:val="0"/>
+                <w:i w:val="0"/>
+                <w:sz w:val="18"/>
+              </w:rPr>
+              <w:t>954</w:t>
+            </w:r>
+          </w:p>
+        </w:tc>
+        <w:tc>
+          <w:tcPr>
+            <w:tcW w:type="dxa" w:w="992"/>
+          </w:tcPr>
+          <w:p>
+            <w:pPr>
+              <w:spacing w:after="0" w:before="20"/>
+              <w:jc w:val="right"/>
+            </w:pPr>
+            <w:r/>
+            <w:r>
+              <w:rPr>
+                <w:b w:val="0"/>
+                <w:i w:val="0"/>
+                <w:sz w:val="18"/>
+              </w:rPr>
+              <w:t>2.000</w:t>
+            </w:r>
+          </w:p>
+        </w:tc>
+        <w:tc>
+          <w:tcPr>
+            <w:tcW w:type="dxa" w:w="992"/>
+          </w:tcPr>
+          <w:p>
+            <w:pPr>
+              <w:spacing w:after="0" w:before="20"/>
+              <w:jc w:val="right"/>
+            </w:pPr>
+            <w:r/>
+            <w:r>
+              <w:rPr>
+                <w:b w:val="0"/>
+                <w:i w:val="0"/>
+                <w:sz w:val="18"/>
+              </w:rPr>
+              <w:t>5.368</w:t>
+            </w:r>
+          </w:p>
+        </w:tc>
+        <w:tc>
+          <w:tcPr>
+            <w:tcW w:type="dxa" w:w="1162"/>
+          </w:tcPr>
+          <w:p>
+            <w:pPr>
+              <w:spacing w:after="0" w:before="20"/>
+              <w:jc w:val="right"/>
+            </w:pPr>
+            <w:r/>
+            <w:r>
+              <w:rPr>
+                <w:b w:val="0"/>
+                <w:i w:val="0"/>
+                <w:sz w:val="18"/>
+              </w:rPr>
+              <w:t>+637,4%</w:t>
+            </w:r>
+          </w:p>
+        </w:tc>
+      </w:tr>
+      <w:tr>
+        <w:tc>
+          <w:tcPr>
+            <w:tcW w:type="dxa" w:w="2438"/>
+          </w:tcPr>
+          <w:p>
+            <w:pPr>
+              <w:spacing w:after="0" w:before="20"/>
+              <w:jc w:val="left"/>
+            </w:pPr>
+            <w:r/>
+            <w:r>
+              <w:rPr>
+                <w:b w:val="0"/>
+                <w:i w:val="0"/>
+                <w:sz w:val="18"/>
+              </w:rPr>
+              <w:t>395. Paiçandu</w:t>
             </w:r>
           </w:p>
         </w:tc>
@@ -3052,7 +3052,7 @@
                 <w:i w:val="0"/>
                 <w:sz w:val="18"/>
               </w:rPr>
-              <w:t>365. Pontal do Paraná</w:t>
+              <w:t>396. Pontal do Paraná</w:t>
             </w:r>
           </w:p>
         </w:tc>
@@ -3214,7 +3214,7 @@
                 <w:i w:val="0"/>
                 <w:sz w:val="18"/>
               </w:rPr>
-              <w:t>366. Itaperuçu</w:t>
+              <w:t>397. Itaperuçu</w:t>
             </w:r>
           </w:p>
         </w:tc>
@@ -3376,7 +3376,7 @@
                 <w:i w:val="0"/>
                 <w:sz w:val="18"/>
               </w:rPr>
-              <w:t>367. Almirante Tamandaré</w:t>
+              <w:t>398. Almirante Tamandaré</w:t>
             </w:r>
           </w:p>
         </w:tc>
@@ -3538,7 +3538,7 @@
                 <w:i w:val="0"/>
                 <w:sz w:val="18"/>
               </w:rPr>
-              <w:t>368. Sarandi</w:t>
+              <w:t>399. Sarandi</w:t>
             </w:r>
           </w:p>
         </w:tc>
@@ -3705,7 +3705,7 @@
                 <w:i w:val="0"/>
                 <w:sz w:val="18"/>
               </w:rPr>
-              <w:t>Razão máx./mín. – 368 municípios</w:t>
+              <w:t>Razão máx./mín. – 399 municípios</w:t>
             </w:r>
           </w:p>
         </w:tc>
@@ -3729,7 +3729,7 @@
                 <w:i w:val="0"/>
                 <w:sz w:val="18"/>
               </w:rPr>
-              <w:t>13,1</w:t>
+              <w:t>14,0</w:t>
             </w:r>
           </w:p>
         </w:tc>
@@ -3753,7 +3753,7 @@
                 <w:i w:val="0"/>
                 <w:sz w:val="18"/>
               </w:rPr>
-              <w:t>12,6</w:t>
+              <w:t>13,2</w:t>
             </w:r>
           </w:p>
         </w:tc>
@@ -3849,7 +3849,7 @@
                 <w:i w:val="0"/>
                 <w:sz w:val="18"/>
               </w:rPr>
-              <w:t>−78,6%</w:t>
+              <w:t>−80,0%</w:t>
             </w:r>
           </w:p>
         </w:tc>
@@ -3876,7 +3876,7 @@
                 <w:i w:val="0"/>
                 <w:sz w:val="18"/>
               </w:rPr>
-              <w:t>Índice de Gini – 368 municípios</w:t>
+              <w:t>Índice de Gini – 399 municípios</w:t>
             </w:r>
           </w:p>
         </w:tc>
@@ -3900,7 +3900,7 @@
                 <w:i w:val="0"/>
                 <w:sz w:val="18"/>
               </w:rPr>
-              <w:t>0,230</w:t>
+              <w:t>0,234</w:t>
             </w:r>
           </w:p>
         </w:tc>
@@ -3924,7 +3924,7 @@
                 <w:i w:val="0"/>
                 <w:sz w:val="18"/>
               </w:rPr>
-              <w:t>0,228</w:t>
+              <w:t>0,231</w:t>
             </w:r>
           </w:p>
         </w:tc>
@@ -3948,7 +3948,7 @@
                 <w:i w:val="0"/>
                 <w:sz w:val="18"/>
               </w:rPr>
-              <w:t>0,224</w:t>
+              <w:t>0,225</w:t>
             </w:r>
           </w:p>
         </w:tc>
@@ -3972,7 +3972,7 @@
                 <w:i w:val="0"/>
                 <w:sz w:val="18"/>
               </w:rPr>
-              <w:t>0,174</w:t>
+              <w:t>0,175</w:t>
             </w:r>
           </w:p>
         </w:tc>
@@ -3996,7 +3996,7 @@
                 <w:i w:val="0"/>
                 <w:sz w:val="18"/>
               </w:rPr>
-              <w:t>0,121</w:t>
+              <w:t>0,123</w:t>
             </w:r>
           </w:p>
         </w:tc>
@@ -4020,7 +4020,7 @@
                 <w:i w:val="0"/>
                 <w:sz w:val="18"/>
               </w:rPr>
-              <w:t>−47,3%</w:t>
+              <w:t>−47,5%</w:t>
             </w:r>
           </w:p>
         </w:tc>
@@ -4048,7 +4048,7 @@
           <w:i w:val="0"/>
           <w:sz w:val="16"/>
         </w:rPr>
-        <w:t>Fonte: elaboração própria, com base na DCA/Siconfi, no Portal da Transparência do Paraná e no PIT/TCE-PR (base municipal final auditada). Nota: receita per capita = ISS + cota-parte do ICMS em 2025, substituídos pelo IBS municipal de 2029 em diante, conforme o cronograma do art. 131 do ADCT (EC 132/2023) e PIB real de 2,2% a.a. após 2033; valores em R$ constantes de 2025 e população fixa (média 2019-2026). Razão máx./mín. = maior valor per capita dividido pelo menor; Índice de Gini (0 = igualdade perfeita). As duas medidas consideram todos os municípios elegíveis, e não apenas os exibidos; os municípios intermediários foram omitidos (...).</w:t>
+        <w:t>Fonte: elaboração própria, com base na DCA/Siconfi, no Portal da Transparência do Paraná e no PIT/TCE-PR (base municipal final auditada). Nota: receita per capita = ISS + cota-parte do ICMS em 2025, substituídos pelo IBS municipal de 2029 em diante, conforme o cronograma do art. 131 do ADCT (EC 132/2023) e PIB real de 2,2% a.a. após 2033; valores em R$ constantes de 2025 e população fixa (média 2019-2026). Razão máx./mín. = maior valor per capita dividido pelo menor; Índice de Gini (0 = igualdade perfeita). As duas medidas consideram os 399 municípios do Estado, e não apenas os exibidos; os municípios intermediários foram omitidos (...).</w:t>
       </w:r>
     </w:p>
     <w:sectPr>

</xml_diff>

<commit_message>
Estudo 18: Seguro-Receita (lei, exemplo, nível de entrada e beneficiários); população completa inclui município novo; dados regenerados
Co-Authored-By: Claude Sonnet 5.5 <noreply@anthropic.com>
Claude-Session: https://claude.ai/code/session_011eEoECqArDQbSEYFrfCHxJ
</commit_message>
<xml_diff>
--- a/data/auditoria-pr-validacao/tabelas-artigo/tabela-unica-dispersao-percapita-pr.docx
+++ b/data/auditoria-pr-validacao/tabelas-artigo/tabela-unica-dispersao-percapita-pr.docx
@@ -742,7 +742,7 @@
                 <w:i w:val="0"/>
                 <w:sz w:val="18"/>
               </w:rPr>
-              <w:t>16.556</w:t>
+              <w:t>16.555</w:t>
             </w:r>
           </w:p>
         </w:tc>
@@ -1208,7 +1208,7 @@
                 <w:i w:val="0"/>
                 <w:sz w:val="18"/>
               </w:rPr>
-              <w:t>7.929</w:t>
+              <w:t>7.928</w:t>
             </w:r>
           </w:p>
         </w:tc>
@@ -1228,7 +1228,7 @@
                 <w:i w:val="0"/>
                 <w:sz w:val="18"/>
               </w:rPr>
-              <w:t>10.703</w:t>
+              <w:t>10.702</w:t>
             </w:r>
           </w:p>
         </w:tc>
@@ -1552,7 +1552,7 @@
                 <w:i w:val="0"/>
                 <w:sz w:val="18"/>
               </w:rPr>
-              <w:t>10.170</w:t>
+              <w:t>10.169</w:t>
             </w:r>
           </w:p>
         </w:tc>
@@ -1714,7 +1714,7 @@
                 <w:i w:val="0"/>
                 <w:sz w:val="18"/>
               </w:rPr>
-              <w:t>15.710</w:t>
+              <w:t>15.709</w:t>
             </w:r>
           </w:p>
         </w:tc>
@@ -1734,7 +1734,7 @@
                 <w:i w:val="0"/>
                 <w:sz w:val="18"/>
               </w:rPr>
-              <w:t>+261,5%</w:t>
+              <w:t>+261,4%</w:t>
             </w:r>
           </w:p>
         </w:tc>

</xml_diff>